<commit_message>
update the final document
</commit_message>
<xml_diff>
--- a/docs/YallaMarket_SRS_v3.docx
+++ b/docs/YallaMarket_SRS_v3.docx
@@ -6,6 +6,7 @@
       <w:pPr>
         <w:jc w:val="center"/>
       </w:pPr>
+      <w:proofErr w:type="spellStart"/>
       <w:r>
         <w:rPr>
           <w:b/>
@@ -14,19 +15,40 @@
         </w:rPr>
         <w:t>YallaMarket</w:t>
       </w:r>
+      <w:proofErr w:type="spellEnd"/>
     </w:p>
     <w:p>
       <w:pPr>
         <w:jc w:val="center"/>
       </w:pPr>
+      <w:proofErr w:type="spellStart"/>
       <w:r>
         <w:rPr>
           <w:b/>
           <w:color w:val="F59200"/>
           <w:sz w:val="40"/>
         </w:rPr>
-        <w:t>يلا ماركت</w:t>
+        <w:t>يلا</w:t>
       </w:r>
+      <w:proofErr w:type="spellEnd"/>
+      <w:r>
+        <w:rPr>
+          <w:b/>
+          <w:color w:val="F59200"/>
+          <w:sz w:val="40"/>
+        </w:rPr>
+        <w:t xml:space="preserve"> </w:t>
+      </w:r>
+      <w:proofErr w:type="spellStart"/>
+      <w:r>
+        <w:rPr>
+          <w:b/>
+          <w:color w:val="F59200"/>
+          <w:sz w:val="40"/>
+        </w:rPr>
+        <w:t>ماركت</w:t>
+      </w:r>
+      <w:proofErr w:type="spellEnd"/>
     </w:p>
     <w:p>
       <w:pPr>
@@ -109,9 +131,11 @@
             <w:vAlign w:val="center"/>
           </w:tcPr>
           <w:p>
+            <w:proofErr w:type="spellStart"/>
             <w:r>
               <w:t>YallaMarket</w:t>
             </w:r>
+            <w:proofErr w:type="spellEnd"/>
           </w:p>
         </w:tc>
       </w:tr>
@@ -299,7 +323,7 @@
           </w:tcPr>
           <w:p>
             <w:r>
-              <w:t>Professional Delivery Draft</w:t>
+              <w:t>Final Submission Version</w:t>
             </w:r>
           </w:p>
         </w:tc>
@@ -314,7 +338,21 @@
         <w:rPr>
           <w:i/>
         </w:rPr>
-        <w:t>Document Summary: This SRS describes the current full-stack version of YallaMarket, a bilingual digital marketplace for game cards, subscriptions, balances, and digital products. It covers requirements, architecture, data needs, constraints, assumptions, agile execution, and planned extensions.</w:t>
+        <w:t xml:space="preserve">Document Summary: This SRS describes the current full-stack version of </w:t>
+      </w:r>
+      <w:proofErr w:type="spellStart"/>
+      <w:r>
+        <w:rPr>
+          <w:i/>
+        </w:rPr>
+        <w:t>YallaMarket</w:t>
+      </w:r>
+      <w:proofErr w:type="spellEnd"/>
+      <w:r>
+        <w:rPr>
+          <w:i/>
+        </w:rPr>
+        <w:t>, a bilingual digital marketplace for game cards, subscriptions, balances, and digital products. It covers requirements, architecture, data needs, constraints, assumptions, agile execution, and planned extensions.</w:t>
       </w:r>
     </w:p>
     <w:p>
@@ -484,7 +522,15 @@
     </w:p>
     <w:p>
       <w:r>
-        <w:t>This Software Requirements Specification (SRS) defines the requirements for YallaMarket, a web-based digital marketplace focused on selling game cards, subscriptions, electronic balances, and related digital products. The document is intended for the project team, instructors, reviewers, future maintainers, and any stakeholder who needs a clear understanding of what the system does and how it is expected to behave.</w:t>
+        <w:t xml:space="preserve">This Software Requirements Specification (SRS) defines the requirements for </w:t>
+      </w:r>
+      <w:proofErr w:type="spellStart"/>
+      <w:r>
+        <w:t>YallaMarket</w:t>
+      </w:r>
+      <w:proofErr w:type="spellEnd"/>
+      <w:r>
+        <w:t>, a web-based digital marketplace focused on selling game cards, subscriptions, electronic balances, and related digital products. The document is intended for the project team, instructors, reviewers, future maintainers, and any stakeholder who needs a clear understanding of what the system does and how it is expected to behave.</w:t>
       </w:r>
     </w:p>
     <w:p>
@@ -499,13 +545,40 @@
       </w:r>
     </w:p>
     <w:p>
+      <w:proofErr w:type="spellStart"/>
       <w:r>
-        <w:t>YallaMarket provides a modern storefront experience for Arabic and English users. Users can browse categories, open category pages, search/filter products, view product details, add products to a cart, and complete a checkout flow. The project initially started as a frontend-first implementation and evolved into a partially integrated full-stack system with backend services, SQLite persistence, and authentication endpoints.</w:t>
+        <w:t>YallaMarket</w:t>
+      </w:r>
+      <w:proofErr w:type="spellEnd"/>
+      <w:r>
+        <w:t xml:space="preserve"> provides a modern storefront experience for Arabic and English users. Users can browse categories, open category pages, search/filter products, view product details, add products to a cart, and complete a checkout flow. The project initially started as a frontend-first implementation and evolved into </w:t>
+      </w:r>
+      <w:r>
+        <w:t xml:space="preserve">an </w:t>
+      </w:r>
+      <w:r>
+        <w:t>implemented full-stack system</w:t>
       </w:r>
     </w:p>
     <w:p>
       <w:r>
-        <w:t>The design is inspired by the navigation and shopping flow of Biddimarket.ps, but the visual identity, structure, and implementation are customized for YallaMarket and the course project requirements.</w:t>
+        <w:t xml:space="preserve"> </w:t>
+      </w:r>
+      <w:r>
+        <w:t>with backend services, SQLite persistence, and authentication endpoints.</w:t>
+      </w:r>
+    </w:p>
+    <w:p>
+      <w:r>
+        <w:t xml:space="preserve">The design is inspired by the navigation and shopping flow of Biddimarket.ps, but the visual identity, structure, and implementation are customized for </w:t>
+      </w:r>
+      <w:proofErr w:type="spellStart"/>
+      <w:r>
+        <w:t>YallaMarket</w:t>
+      </w:r>
+      <w:proofErr w:type="spellEnd"/>
+      <w:r>
+        <w:t xml:space="preserve"> and the course project requirements.</w:t>
       </w:r>
     </w:p>
     <w:p>
@@ -596,7 +669,7 @@
         <w:pStyle w:val="ListBullet"/>
       </w:pPr>
       <w:r>
-        <w:t>Admin features and advanced payment gateway integration remain planned extensions unless explicitly implemented in the final codebase.</w:t>
+        <w:t>Admin features and payment workflows are integrated into the current full-stack implementation and can be extended further in future versions.</w:t>
       </w:r>
     </w:p>
     <w:p>
@@ -1096,7 +1169,16 @@
         <w:pStyle w:val="ListBullet"/>
       </w:pPr>
       <w:r>
-        <w:t>Express.js, SQLite, bcryptjs, and JWT documentation.</w:t>
+        <w:lastRenderedPageBreak/>
+        <w:t xml:space="preserve">Express.js, SQLite, </w:t>
+      </w:r>
+      <w:proofErr w:type="spellStart"/>
+      <w:r>
+        <w:t>bcryptjs</w:t>
+      </w:r>
+      <w:proofErr w:type="spellEnd"/>
+      <w:r>
+        <w:t>, and JWT documentation.</w:t>
       </w:r>
     </w:p>
     <w:p>
@@ -1104,7 +1186,6 @@
         <w:pStyle w:val="ListBullet"/>
       </w:pPr>
       <w:r>
-        <w:lastRenderedPageBreak/>
         <w:t>Project artifacts including Jira backlog, sprint plan, GitHub repository, UML diagrams, ERD, and architecture diagram.</w:t>
       </w:r>
     </w:p>
@@ -1131,8 +1212,13 @@
       </w:r>
     </w:p>
     <w:p>
+      <w:proofErr w:type="spellStart"/>
       <w:r>
-        <w:t>YallaMarket is a modular web application. The frontend is built using React, Vite, Tailwind CSS, React Router, and Context API. The backend is built using Express.js and SQLite, providing server-side support for authentication, catalog retrieval, and order-related functionality.</w:t>
+        <w:t>YallaMarket</w:t>
+      </w:r>
+      <w:proofErr w:type="spellEnd"/>
+      <w:r>
+        <w:t xml:space="preserve"> is a modular web application. The frontend is built using React, Vite, Tailwind CSS, React Router, and Context API. The backend is built using Express.js and SQLite, providing server-side support for authentication, catalog retrieval, and order-related functionality.</w:t>
       </w:r>
     </w:p>
     <w:p>
@@ -1501,7 +1587,15 @@
         <w:pStyle w:val="ListBullet"/>
       </w:pPr>
       <w:r>
-        <w:t>Local development uses Node.js and npm scripts.</w:t>
+        <w:t xml:space="preserve">Local development uses Node.js and </w:t>
+      </w:r>
+      <w:proofErr w:type="spellStart"/>
+      <w:r>
+        <w:t>npm</w:t>
+      </w:r>
+      <w:proofErr w:type="spellEnd"/>
+      <w:r>
+        <w:t xml:space="preserve"> scripts.</w:t>
       </w:r>
     </w:p>
     <w:p>
@@ -1587,6 +1681,7 @@
         <w:rPr>
           <w:color w:val="1F4E79"/>
         </w:rPr>
+        <w:lastRenderedPageBreak/>
         <w:t>3. System Architecture</w:t>
       </w:r>
     </w:p>
@@ -1634,7 +1729,6 @@
                 <w:b/>
                 <w:sz w:val="17"/>
               </w:rPr>
-              <w:lastRenderedPageBreak/>
               <w:t>Layer</w:t>
             </w:r>
           </w:p>
@@ -1837,12 +1931,14 @@
             <w:vAlign w:val="center"/>
           </w:tcPr>
           <w:p>
+            <w:proofErr w:type="spellStart"/>
             <w:r>
               <w:rPr>
                 <w:sz w:val="17"/>
               </w:rPr>
               <w:t>localStorage</w:t>
             </w:r>
+            <w:proofErr w:type="spellEnd"/>
           </w:p>
         </w:tc>
         <w:tc>
@@ -2072,7 +2168,7 @@
               <w:rPr>
                 <w:sz w:val="17"/>
               </w:rPr>
-              <w:t>Implemented / refined</w:t>
+              <w:t>Implemented</w:t>
             </w:r>
           </w:p>
         </w:tc>
@@ -2180,7 +2276,21 @@
               <w:rPr>
                 <w:sz w:val="17"/>
               </w:rPr>
-              <w:t>Uses centralized cart state and localStorage persistence.</w:t>
+              <w:t xml:space="preserve">Uses centralized cart state and </w:t>
+            </w:r>
+            <w:proofErr w:type="spellStart"/>
+            <w:r>
+              <w:rPr>
+                <w:sz w:val="17"/>
+              </w:rPr>
+              <w:t>localStorage</w:t>
+            </w:r>
+            <w:proofErr w:type="spellEnd"/>
+            <w:r>
+              <w:rPr>
+                <w:sz w:val="17"/>
+              </w:rPr>
+              <w:t xml:space="preserve"> persistence.</w:t>
             </w:r>
           </w:p>
         </w:tc>
@@ -2213,7 +2323,7 @@
               <w:rPr>
                 <w:sz w:val="17"/>
               </w:rPr>
-              <w:t>Implemented / partially integrated</w:t>
+              <w:t>Implemented</w:t>
             </w:r>
           </w:p>
         </w:tc>
@@ -2262,15 +2372,6 @@
               </w:rPr>
               <w:t>Implemented</w:t>
             </w:r>
-            <w:r>
-              <w:t xml:space="preserve"> </w:t>
-            </w:r>
-            <w:r>
-              <w:rPr>
-                <w:sz w:val="17"/>
-              </w:rPr>
-              <w:t>/ partially</w:t>
-            </w:r>
           </w:p>
         </w:tc>
         <w:tc>
@@ -2359,12 +2460,20 @@
             <w:vAlign w:val="center"/>
           </w:tcPr>
           <w:p>
+            <w:pPr>
+              <w:rPr>
+                <w:rtl/>
+              </w:rPr>
+            </w:pPr>
             <w:r>
               <w:rPr>
                 <w:sz w:val="17"/>
               </w:rPr>
               <w:t>Implemented</w:t>
             </w:r>
+            <w:r>
+              <w:t xml:space="preserve"> </w:t>
+            </w:r>
           </w:p>
         </w:tc>
         <w:tc>
@@ -2375,9 +2484,10 @@
           <w:p>
             <w:r>
               <w:rPr>
-                <w:sz w:val="17"/>
-              </w:rPr>
-              <w:t>Not required in the current delivery unless explicitly added.</w:t>
+                <w:sz w:val="16"/>
+                <w:szCs w:val="18"/>
+              </w:rPr>
+              <w:t>Integrated into the current system for managing products and orders, with category management supported through backend APIs.</w:t>
             </w:r>
           </w:p>
         </w:tc>
@@ -2406,11 +2516,16 @@
             <w:vAlign w:val="center"/>
           </w:tcPr>
           <w:p>
-            <w:r>
+            <w:pPr>
               <w:rPr>
                 <w:sz w:val="17"/>
               </w:rPr>
-              <w:t>Implemented</w:t>
+            </w:pPr>
+            <w:r>
+              <w:rPr>
+                <w:sz w:val="17"/>
+              </w:rPr>
+              <w:t>Partially Implemented</w:t>
             </w:r>
           </w:p>
         </w:tc>
@@ -2420,11 +2535,16 @@
             <w:vAlign w:val="center"/>
           </w:tcPr>
           <w:p>
-            <w:r>
+            <w:pPr>
               <w:rPr>
                 <w:sz w:val="17"/>
               </w:rPr>
-              <w:t>Payment method selection exists; real external gateway remains future work.</w:t>
+            </w:pPr>
+            <w:r>
+              <w:rPr>
+                <w:sz w:val="17"/>
+              </w:rPr>
+              <w:t>Payment method selection is implemented in checkout; real external payment provider integration is planned for future versions.</w:t>
             </w:r>
           </w:p>
         </w:tc>
@@ -2766,7 +2886,7 @@
               <w:rPr>
                 <w:sz w:val="15"/>
               </w:rPr>
-              <w:t>Implemented / must verify</w:t>
+              <w:t>Implemented</w:t>
             </w:r>
           </w:p>
         </w:tc>
@@ -2935,6 +3055,7 @@
               <w:rPr>
                 <w:sz w:val="15"/>
               </w:rPr>
+              <w:lastRenderedPageBreak/>
               <w:t>FR-06</w:t>
             </w:r>
           </w:p>
@@ -3113,7 +3234,21 @@
               <w:rPr>
                 <w:sz w:val="15"/>
               </w:rPr>
-              <w:t>The system shall preserve cart contents in localStorage between sessions.</w:t>
+              <w:t xml:space="preserve">The system shall preserve cart contents in </w:t>
+            </w:r>
+            <w:proofErr w:type="spellStart"/>
+            <w:r>
+              <w:rPr>
+                <w:sz w:val="15"/>
+              </w:rPr>
+              <w:t>localStorage</w:t>
+            </w:r>
+            <w:proofErr w:type="spellEnd"/>
+            <w:r>
+              <w:rPr>
+                <w:sz w:val="15"/>
+              </w:rPr>
+              <w:t xml:space="preserve"> between sessions.</w:t>
             </w:r>
           </w:p>
         </w:tc>
@@ -3441,7 +3576,7 @@
               <w:rPr>
                 <w:sz w:val="15"/>
               </w:rPr>
-              <w:t>Implemented / refined</w:t>
+              <w:t>Implemented</w:t>
             </w:r>
           </w:p>
         </w:tc>
@@ -3516,7 +3651,7 @@
               <w:rPr>
                 <w:sz w:val="15"/>
               </w:rPr>
-              <w:t>Backend implemented</w:t>
+              <w:t>Implemented</w:t>
             </w:r>
           </w:p>
         </w:tc>
@@ -3535,7 +3670,6 @@
               <w:rPr>
                 <w:sz w:val="15"/>
               </w:rPr>
-              <w:lastRenderedPageBreak/>
               <w:t>FR-14</w:t>
             </w:r>
           </w:p>
@@ -3588,11 +3722,16 @@
             <w:vAlign w:val="center"/>
           </w:tcPr>
           <w:p>
-            <w:r>
-              <w:rPr>
-                <w:sz w:val="15"/>
-              </w:rPr>
-              <w:t>Backend implemented</w:t>
+            <w:pPr>
+              <w:rPr>
+                <w:sz w:val="15"/>
+              </w:rPr>
+            </w:pPr>
+            <w:r>
+              <w:rPr>
+                <w:sz w:val="15"/>
+              </w:rPr>
+              <w:t>Implemented</w:t>
             </w:r>
           </w:p>
         </w:tc>
@@ -3663,11 +3802,16 @@
             <w:vAlign w:val="center"/>
           </w:tcPr>
           <w:p>
-            <w:r>
-              <w:rPr>
-                <w:sz w:val="15"/>
-              </w:rPr>
-              <w:t>Backend implemented</w:t>
+            <w:pPr>
+              <w:rPr>
+                <w:sz w:val="15"/>
+              </w:rPr>
+            </w:pPr>
+            <w:r>
+              <w:rPr>
+                <w:sz w:val="15"/>
+              </w:rPr>
+              <w:t>Partially Implemented</w:t>
             </w:r>
           </w:p>
         </w:tc>
@@ -3738,11 +3882,16 @@
             <w:vAlign w:val="center"/>
           </w:tcPr>
           <w:p>
-            <w:r>
-              <w:rPr>
-                <w:sz w:val="15"/>
-              </w:rPr>
-              <w:t>Implemented / planned extension</w:t>
+            <w:pPr>
+              <w:rPr>
+                <w:sz w:val="15"/>
+              </w:rPr>
+            </w:pPr>
+            <w:r>
+              <w:rPr>
+                <w:sz w:val="15"/>
+              </w:rPr>
+              <w:t>Partially Implemented</w:t>
             </w:r>
           </w:p>
         </w:tc>
@@ -3817,7 +3966,7 @@
               <w:rPr>
                 <w:sz w:val="15"/>
               </w:rPr>
-              <w:t>Implemented / must verify</w:t>
+              <w:t>Implemented</w:t>
             </w:r>
           </w:p>
         </w:tc>
@@ -3862,9 +4011,10 @@
           <w:p>
             <w:r>
               <w:rPr>
-                <w:sz w:val="15"/>
-              </w:rPr>
-              <w:t>The system shall allow admins to manage categories, products, and orders in a future admin module.</w:t>
+                <w:sz w:val="14"/>
+                <w:szCs w:val="16"/>
+              </w:rPr>
+              <w:t>The system shall allow admins to manage products, view and update orders, while category management is supported through backend APIs.</w:t>
             </w:r>
           </w:p>
         </w:tc>
@@ -3888,11 +4038,16 @@
             <w:vAlign w:val="center"/>
           </w:tcPr>
           <w:p>
-            <w:r>
-              <w:rPr>
-                <w:sz w:val="15"/>
-              </w:rPr>
-              <w:t>Implemented</w:t>
+            <w:pPr>
+              <w:rPr>
+                <w:sz w:val="15"/>
+              </w:rPr>
+            </w:pPr>
+            <w:r>
+              <w:rPr>
+                <w:sz w:val="15"/>
+              </w:rPr>
+              <w:t>Partially Implemented</w:t>
             </w:r>
           </w:p>
         </w:tc>
@@ -4692,7 +4847,14 @@
               <w:rPr>
                 <w:sz w:val="15"/>
               </w:rPr>
-              <w:t>Code shall be organized into pages, components, services, context, server, and database modules.</w:t>
+              <w:t xml:space="preserve">Code shall be organized into pages, components, services, context, server, and </w:t>
+            </w:r>
+            <w:r>
+              <w:rPr>
+                <w:sz w:val="15"/>
+              </w:rPr>
+              <w:lastRenderedPageBreak/>
+              <w:t>database modules.</w:t>
             </w:r>
           </w:p>
         </w:tc>
@@ -4706,6 +4868,7 @@
               <w:rPr>
                 <w:sz w:val="15"/>
               </w:rPr>
+              <w:lastRenderedPageBreak/>
               <w:t>Clear structure</w:t>
             </w:r>
           </w:p>
@@ -4753,7 +4916,49 @@
               <w:rPr>
                 <w:sz w:val="15"/>
               </w:rPr>
-              <w:t>Common UI such as ProductCard, OrderSummary, and QuantitySelector should be reused.</w:t>
+              <w:t xml:space="preserve">Common UI such as </w:t>
+            </w:r>
+            <w:proofErr w:type="spellStart"/>
+            <w:r>
+              <w:rPr>
+                <w:sz w:val="15"/>
+              </w:rPr>
+              <w:t>ProductCard</w:t>
+            </w:r>
+            <w:proofErr w:type="spellEnd"/>
+            <w:r>
+              <w:rPr>
+                <w:sz w:val="15"/>
+              </w:rPr>
+              <w:t xml:space="preserve">, </w:t>
+            </w:r>
+            <w:proofErr w:type="spellStart"/>
+            <w:r>
+              <w:rPr>
+                <w:sz w:val="15"/>
+              </w:rPr>
+              <w:t>OrderSummary</w:t>
+            </w:r>
+            <w:proofErr w:type="spellEnd"/>
+            <w:r>
+              <w:rPr>
+                <w:sz w:val="15"/>
+              </w:rPr>
+              <w:t xml:space="preserve">, and </w:t>
+            </w:r>
+            <w:proofErr w:type="spellStart"/>
+            <w:r>
+              <w:rPr>
+                <w:sz w:val="15"/>
+              </w:rPr>
+              <w:t>QuantitySelector</w:t>
+            </w:r>
+            <w:proofErr w:type="spellEnd"/>
+            <w:r>
+              <w:rPr>
+                <w:sz w:val="15"/>
+              </w:rPr>
+              <w:t xml:space="preserve"> should be reused.</w:t>
             </w:r>
           </w:p>
         </w:tc>
@@ -4824,11 +5029,19 @@
             <w:vAlign w:val="center"/>
           </w:tcPr>
           <w:p>
-            <w:r>
-              <w:rPr>
-                <w:sz w:val="15"/>
-              </w:rPr>
-              <w:t>bcrypt/JWT/.env</w:t>
+            <w:proofErr w:type="spellStart"/>
+            <w:r>
+              <w:rPr>
+                <w:sz w:val="15"/>
+              </w:rPr>
+              <w:t>bcrypt</w:t>
+            </w:r>
+            <w:proofErr w:type="spellEnd"/>
+            <w:r>
+              <w:rPr>
+                <w:sz w:val="15"/>
+              </w:rPr>
+              <w:t>/JWT/.env</w:t>
             </w:r>
           </w:p>
         </w:tc>
@@ -4993,11 +5206,16 @@
             <w:vAlign w:val="center"/>
           </w:tcPr>
           <w:p>
-            <w:r>
-              <w:rPr>
-                <w:sz w:val="15"/>
-              </w:rPr>
-              <w:t>The system shall include documented test cases and bug tracking in Jira.</w:t>
+            <w:pPr>
+              <w:rPr>
+                <w:sz w:val="15"/>
+              </w:rPr>
+            </w:pPr>
+            <w:r>
+              <w:rPr>
+                <w:sz w:val="15"/>
+              </w:rPr>
+              <w:t>The project documentation should include manual test cases and Jira bug tracking evidence.</w:t>
             </w:r>
           </w:p>
         </w:tc>
@@ -5026,7 +5244,6 @@
         <w:rPr>
           <w:color w:val="1F4E79"/>
         </w:rPr>
-        <w:lastRenderedPageBreak/>
         <w:t>7. Use Cases</w:t>
       </w:r>
     </w:p>
@@ -6160,12 +6377,14 @@
             <w:vAlign w:val="center"/>
           </w:tcPr>
           <w:p>
+            <w:proofErr w:type="spellStart"/>
             <w:r>
               <w:rPr>
                 <w:sz w:val="16"/>
               </w:rPr>
               <w:t>name_ar</w:t>
             </w:r>
+            <w:proofErr w:type="spellEnd"/>
           </w:p>
         </w:tc>
         <w:tc>
@@ -6207,12 +6426,14 @@
             <w:vAlign w:val="center"/>
           </w:tcPr>
           <w:p>
+            <w:proofErr w:type="spellStart"/>
             <w:r>
               <w:rPr>
                 <w:sz w:val="16"/>
               </w:rPr>
               <w:t>name_en</w:t>
             </w:r>
+            <w:proofErr w:type="spellEnd"/>
           </w:p>
         </w:tc>
         <w:tc>
@@ -6254,12 +6475,14 @@
             <w:vAlign w:val="center"/>
           </w:tcPr>
           <w:p>
+            <w:proofErr w:type="spellStart"/>
             <w:r>
               <w:rPr>
                 <w:sz w:val="16"/>
               </w:rPr>
               <w:t>description_ar</w:t>
             </w:r>
+            <w:proofErr w:type="spellEnd"/>
           </w:p>
         </w:tc>
         <w:tc>
@@ -6301,12 +6524,14 @@
             <w:vAlign w:val="center"/>
           </w:tcPr>
           <w:p>
+            <w:proofErr w:type="spellStart"/>
             <w:r>
               <w:rPr>
                 <w:sz w:val="16"/>
               </w:rPr>
               <w:t>description_en</w:t>
             </w:r>
+            <w:proofErr w:type="spellEnd"/>
           </w:p>
         </w:tc>
         <w:tc>
@@ -6395,12 +6620,14 @@
             <w:vAlign w:val="center"/>
           </w:tcPr>
           <w:p>
+            <w:proofErr w:type="spellStart"/>
             <w:r>
               <w:rPr>
                 <w:sz w:val="16"/>
               </w:rPr>
               <w:t>created_at</w:t>
             </w:r>
+            <w:proofErr w:type="spellEnd"/>
           </w:p>
         </w:tc>
         <w:tc>
@@ -6409,12 +6636,14 @@
             <w:vAlign w:val="center"/>
           </w:tcPr>
           <w:p>
+            <w:proofErr w:type="spellStart"/>
             <w:r>
               <w:rPr>
                 <w:sz w:val="16"/>
               </w:rPr>
               <w:t>DateTime</w:t>
             </w:r>
+            <w:proofErr w:type="spellEnd"/>
           </w:p>
         </w:tc>
         <w:tc>
@@ -6564,12 +6793,14 @@
             <w:vAlign w:val="center"/>
           </w:tcPr>
           <w:p>
+            <w:proofErr w:type="spellStart"/>
             <w:r>
               <w:rPr>
                 <w:sz w:val="15"/>
               </w:rPr>
               <w:t>category_id</w:t>
             </w:r>
+            <w:proofErr w:type="spellEnd"/>
           </w:p>
         </w:tc>
         <w:tc>
@@ -6658,12 +6889,14 @@
             <w:vAlign w:val="center"/>
           </w:tcPr>
           <w:p>
+            <w:proofErr w:type="spellStart"/>
             <w:r>
               <w:rPr>
                 <w:sz w:val="15"/>
               </w:rPr>
               <w:t>name_ar</w:t>
             </w:r>
+            <w:proofErr w:type="spellEnd"/>
           </w:p>
         </w:tc>
         <w:tc>
@@ -6705,12 +6938,14 @@
             <w:vAlign w:val="center"/>
           </w:tcPr>
           <w:p>
+            <w:proofErr w:type="spellStart"/>
             <w:r>
               <w:rPr>
                 <w:sz w:val="15"/>
               </w:rPr>
               <w:t>name_en</w:t>
             </w:r>
+            <w:proofErr w:type="spellEnd"/>
           </w:p>
         </w:tc>
         <w:tc>
@@ -6752,12 +6987,14 @@
             <w:vAlign w:val="center"/>
           </w:tcPr>
           <w:p>
+            <w:proofErr w:type="spellStart"/>
             <w:r>
               <w:rPr>
                 <w:sz w:val="15"/>
               </w:rPr>
               <w:t>short_description_ar</w:t>
             </w:r>
+            <w:proofErr w:type="spellEnd"/>
           </w:p>
         </w:tc>
         <w:tc>
@@ -6799,12 +7036,14 @@
             <w:vAlign w:val="center"/>
           </w:tcPr>
           <w:p>
+            <w:proofErr w:type="spellStart"/>
             <w:r>
               <w:rPr>
                 <w:sz w:val="15"/>
               </w:rPr>
               <w:t>short_description_en</w:t>
             </w:r>
+            <w:proofErr w:type="spellEnd"/>
           </w:p>
         </w:tc>
         <w:tc>
@@ -6846,12 +7085,14 @@
             <w:vAlign w:val="center"/>
           </w:tcPr>
           <w:p>
+            <w:proofErr w:type="spellStart"/>
             <w:r>
               <w:rPr>
                 <w:sz w:val="15"/>
               </w:rPr>
               <w:t>description_ar</w:t>
             </w:r>
+            <w:proofErr w:type="spellEnd"/>
           </w:p>
         </w:tc>
         <w:tc>
@@ -6893,12 +7134,14 @@
             <w:vAlign w:val="center"/>
           </w:tcPr>
           <w:p>
+            <w:proofErr w:type="spellStart"/>
             <w:r>
               <w:rPr>
                 <w:sz w:val="15"/>
               </w:rPr>
               <w:t>description_en</w:t>
             </w:r>
+            <w:proofErr w:type="spellEnd"/>
           </w:p>
         </w:tc>
         <w:tc>
@@ -7081,12 +7324,14 @@
             <w:vAlign w:val="center"/>
           </w:tcPr>
           <w:p>
+            <w:proofErr w:type="spellStart"/>
             <w:r>
               <w:rPr>
                 <w:sz w:val="15"/>
               </w:rPr>
               <w:t>in_stock</w:t>
             </w:r>
+            <w:proofErr w:type="spellEnd"/>
           </w:p>
         </w:tc>
         <w:tc>
@@ -7169,6 +7414,7 @@
     <w:p/>
     <w:p>
       <w:r>
+        <w:lastRenderedPageBreak/>
         <w:br w:type="page"/>
       </w:r>
     </w:p>
@@ -7303,12 +7549,14 @@
             <w:vAlign w:val="center"/>
           </w:tcPr>
           <w:p>
+            <w:proofErr w:type="spellStart"/>
             <w:r>
               <w:rPr>
                 <w:sz w:val="16"/>
               </w:rPr>
               <w:t>full_name</w:t>
             </w:r>
+            <w:proofErr w:type="spellEnd"/>
           </w:p>
         </w:tc>
         <w:tc>
@@ -7444,12 +7692,14 @@
             <w:vAlign w:val="center"/>
           </w:tcPr>
           <w:p>
+            <w:proofErr w:type="spellStart"/>
             <w:r>
               <w:rPr>
                 <w:sz w:val="16"/>
               </w:rPr>
               <w:t>password_hash</w:t>
             </w:r>
+            <w:proofErr w:type="spellEnd"/>
           </w:p>
         </w:tc>
         <w:tc>
@@ -7538,12 +7788,14 @@
             <w:vAlign w:val="center"/>
           </w:tcPr>
           <w:p>
+            <w:proofErr w:type="spellStart"/>
             <w:r>
               <w:rPr>
                 <w:sz w:val="16"/>
               </w:rPr>
               <w:t>created_at</w:t>
             </w:r>
+            <w:proofErr w:type="spellEnd"/>
           </w:p>
         </w:tc>
         <w:tc>
@@ -7552,12 +7804,14 @@
             <w:vAlign w:val="center"/>
           </w:tcPr>
           <w:p>
+            <w:proofErr w:type="spellStart"/>
             <w:r>
               <w:rPr>
                 <w:sz w:val="16"/>
               </w:rPr>
               <w:t>DateTime</w:t>
             </w:r>
+            <w:proofErr w:type="spellEnd"/>
           </w:p>
         </w:tc>
         <w:tc>
@@ -7660,12 +7914,14 @@
             <w:vAlign w:val="center"/>
           </w:tcPr>
           <w:p>
+            <w:proofErr w:type="spellStart"/>
             <w:r>
               <w:rPr>
                 <w:sz w:val="16"/>
               </w:rPr>
               <w:t>productId</w:t>
             </w:r>
+            <w:proofErr w:type="spellEnd"/>
           </w:p>
         </w:tc>
         <w:tc>
@@ -7754,12 +8010,14 @@
             <w:vAlign w:val="center"/>
           </w:tcPr>
           <w:p>
+            <w:proofErr w:type="spellStart"/>
             <w:r>
               <w:rPr>
                 <w:sz w:val="16"/>
               </w:rPr>
               <w:t>selectedOption</w:t>
             </w:r>
+            <w:proofErr w:type="spellEnd"/>
           </w:p>
         </w:tc>
         <w:tc>
@@ -7801,12 +8059,14 @@
             <w:vAlign w:val="center"/>
           </w:tcPr>
           <w:p>
+            <w:proofErr w:type="spellStart"/>
             <w:r>
               <w:rPr>
                 <w:sz w:val="16"/>
               </w:rPr>
               <w:t>unitPrice</w:t>
             </w:r>
+            <w:proofErr w:type="spellEnd"/>
           </w:p>
         </w:tc>
         <w:tc>
@@ -7970,12 +8230,14 @@
             <w:vAlign w:val="center"/>
           </w:tcPr>
           <w:p>
+            <w:proofErr w:type="spellStart"/>
             <w:r>
               <w:rPr>
                 <w:sz w:val="16"/>
               </w:rPr>
               <w:t>user_id</w:t>
             </w:r>
+            <w:proofErr w:type="spellEnd"/>
           </w:p>
         </w:tc>
         <w:tc>
@@ -8017,12 +8279,14 @@
             <w:vAlign w:val="center"/>
           </w:tcPr>
           <w:p>
+            <w:proofErr w:type="spellStart"/>
             <w:r>
               <w:rPr>
                 <w:sz w:val="16"/>
               </w:rPr>
               <w:t>customer_info</w:t>
             </w:r>
+            <w:proofErr w:type="spellEnd"/>
           </w:p>
         </w:tc>
         <w:tc>
@@ -8111,12 +8375,14 @@
             <w:vAlign w:val="center"/>
           </w:tcPr>
           <w:p>
+            <w:proofErr w:type="spellStart"/>
             <w:r>
               <w:rPr>
                 <w:sz w:val="16"/>
               </w:rPr>
               <w:t>delivery_fee</w:t>
             </w:r>
+            <w:proofErr w:type="spellEnd"/>
           </w:p>
         </w:tc>
         <w:tc>
@@ -8205,12 +8471,14 @@
             <w:vAlign w:val="center"/>
           </w:tcPr>
           <w:p>
+            <w:proofErr w:type="spellStart"/>
             <w:r>
               <w:rPr>
                 <w:sz w:val="16"/>
               </w:rPr>
               <w:t>payment_method</w:t>
             </w:r>
+            <w:proofErr w:type="spellEnd"/>
           </w:p>
         </w:tc>
         <w:tc>
@@ -8299,12 +8567,14 @@
             <w:vAlign w:val="center"/>
           </w:tcPr>
           <w:p>
+            <w:proofErr w:type="spellStart"/>
             <w:r>
               <w:rPr>
                 <w:sz w:val="16"/>
               </w:rPr>
               <w:t>created_at</w:t>
             </w:r>
+            <w:proofErr w:type="spellEnd"/>
           </w:p>
         </w:tc>
         <w:tc>
@@ -8313,12 +8583,14 @@
             <w:vAlign w:val="center"/>
           </w:tcPr>
           <w:p>
+            <w:proofErr w:type="spellStart"/>
             <w:r>
               <w:rPr>
                 <w:sz w:val="16"/>
               </w:rPr>
               <w:t>DateTime</w:t>
             </w:r>
+            <w:proofErr w:type="spellEnd"/>
           </w:p>
         </w:tc>
         <w:tc>
@@ -8468,12 +8740,14 @@
             <w:vAlign w:val="center"/>
           </w:tcPr>
           <w:p>
+            <w:proofErr w:type="spellStart"/>
             <w:r>
               <w:rPr>
                 <w:sz w:val="16"/>
               </w:rPr>
               <w:t>order_id</w:t>
             </w:r>
+            <w:proofErr w:type="spellEnd"/>
           </w:p>
         </w:tc>
         <w:tc>
@@ -8515,12 +8789,14 @@
             <w:vAlign w:val="center"/>
           </w:tcPr>
           <w:p>
+            <w:proofErr w:type="spellStart"/>
             <w:r>
               <w:rPr>
                 <w:sz w:val="16"/>
               </w:rPr>
               <w:t>product_id</w:t>
             </w:r>
+            <w:proofErr w:type="spellEnd"/>
           </w:p>
         </w:tc>
         <w:tc>
@@ -8609,12 +8885,14 @@
             <w:vAlign w:val="center"/>
           </w:tcPr>
           <w:p>
+            <w:proofErr w:type="spellStart"/>
             <w:r>
               <w:rPr>
                 <w:sz w:val="16"/>
               </w:rPr>
               <w:t>price_at_order</w:t>
             </w:r>
+            <w:proofErr w:type="spellEnd"/>
           </w:p>
         </w:tc>
         <w:tc>
@@ -8691,7 +8969,15 @@
         <w:pStyle w:val="ListBullet"/>
       </w:pPr>
       <w:r>
-        <w:t>UI refinements should not redesign the established YallaMarket identity.</w:t>
+        <w:t xml:space="preserve">UI refinements should not redesign the established </w:t>
+      </w:r>
+      <w:proofErr w:type="spellStart"/>
+      <w:r>
+        <w:t>YallaMarket</w:t>
+      </w:r>
+      <w:proofErr w:type="spellEnd"/>
+      <w:r>
+        <w:t xml:space="preserve"> identity.</w:t>
       </w:r>
     </w:p>
     <w:p>
@@ -8699,7 +8985,15 @@
         <w:pStyle w:val="ListBullet"/>
       </w:pPr>
       <w:r>
-        <w:t>Real secrets must not be committed to GitHub; examples should be provided through .env.example files.</w:t>
+        <w:t>Real secrets must not be committed to GitHub; examples should be provided through .</w:t>
+      </w:r>
+      <w:proofErr w:type="spellStart"/>
+      <w:r>
+        <w:t>env.example</w:t>
+      </w:r>
+      <w:proofErr w:type="spellEnd"/>
+      <w:r>
+        <w:t xml:space="preserve"> files.</w:t>
       </w:r>
     </w:p>
     <w:p>
@@ -8742,7 +9036,7 @@
         <w:pStyle w:val="ListBullet"/>
       </w:pPr>
       <w:r>
-        <w:t>External payment gateway integration may be simulated or deferred if not required for the final course demo.</w:t>
+        <w:t>Payment workflows are integrated into the implemented checkout and order management process.</w:t>
       </w:r>
     </w:p>
     <w:p>
@@ -8750,7 +9044,7 @@
         <w:pStyle w:val="ListBullet"/>
       </w:pPr>
       <w:r>
-        <w:t>Admin dashboard functionality may be delivered as a planned extension unless separately implemented.</w:t>
+        <w:t>Admin dashboard functionality is integrated into the implemented full-stack system.</w:t>
       </w:r>
     </w:p>
     <w:p>
@@ -9062,12 +9356,14 @@
             <w:vAlign w:val="center"/>
           </w:tcPr>
           <w:p>
+            <w:proofErr w:type="spellStart"/>
             <w:r>
               <w:rPr>
                 <w:sz w:val="16"/>
               </w:rPr>
               <w:t>bcryptjs</w:t>
             </w:r>
+            <w:proofErr w:type="spellEnd"/>
           </w:p>
         </w:tc>
         <w:tc>
@@ -9095,12 +9391,14 @@
             <w:vAlign w:val="center"/>
           </w:tcPr>
           <w:p>
+            <w:proofErr w:type="spellStart"/>
             <w:r>
               <w:rPr>
                 <w:sz w:val="16"/>
               </w:rPr>
               <w:t>jsonwebtoken</w:t>
             </w:r>
+            <w:proofErr w:type="spellEnd"/>
           </w:p>
         </w:tc>
         <w:tc>
@@ -9315,8 +9613,16 @@
               <w:rPr>
                 <w:sz w:val="16"/>
               </w:rPr>
-              <w:t>Hamed Bizerh</w:t>
-            </w:r>
+              <w:t xml:space="preserve">Hamed </w:t>
+            </w:r>
+            <w:proofErr w:type="spellStart"/>
+            <w:r>
+              <w:rPr>
+                <w:sz w:val="16"/>
+              </w:rPr>
+              <w:t>Bizerh</w:t>
+            </w:r>
+            <w:proofErr w:type="spellEnd"/>
           </w:p>
         </w:tc>
       </w:tr>
@@ -9720,7 +10026,7 @@
               <w:rPr>
                 <w:sz w:val="16"/>
               </w:rPr>
-              <w:t>Completed / refined</w:t>
+              <w:t>Completed</w:t>
             </w:r>
           </w:p>
         </w:tc>
@@ -9781,7 +10087,7 @@
               <w:rPr>
                 <w:sz w:val="16"/>
               </w:rPr>
-              <w:t>Completed / in progress</w:t>
+              <w:t>Completed</w:t>
             </w:r>
           </w:p>
         </w:tc>
@@ -9842,7 +10148,7 @@
               <w:rPr>
                 <w:sz w:val="16"/>
               </w:rPr>
-              <w:t>Planned / active</w:t>
+              <w:t>Completed</w:t>
             </w:r>
           </w:p>
         </w:tc>
@@ -9862,7 +10168,31 @@
     </w:p>
     <w:p>
       <w:r>
-        <w:t>Jira is used to track stories, frontend tasks, backend tasks, refinement work, and bugs. Completed stories include ProductCard, CategoryPage, Cart page, CartContext, and UX refinement. Bug tracking should include issues discovered during validation such as seed setup problems, missing search/filter behavior, checkout validation flow, or missing order fields.</w:t>
+        <w:t xml:space="preserve">Jira is used to track stories, frontend tasks, backend tasks, refinement work, and bugs. Completed stories include </w:t>
+      </w:r>
+      <w:proofErr w:type="spellStart"/>
+      <w:r>
+        <w:t>ProductCard</w:t>
+      </w:r>
+      <w:proofErr w:type="spellEnd"/>
+      <w:r>
+        <w:t xml:space="preserve">, </w:t>
+      </w:r>
+      <w:proofErr w:type="spellStart"/>
+      <w:r>
+        <w:t>CategoryPage</w:t>
+      </w:r>
+      <w:proofErr w:type="spellEnd"/>
+      <w:r>
+        <w:t xml:space="preserve">, Cart page, </w:t>
+      </w:r>
+      <w:proofErr w:type="spellStart"/>
+      <w:r>
+        <w:t>CartContext</w:t>
+      </w:r>
+      <w:proofErr w:type="spellEnd"/>
+      <w:r>
+        <w:t>, and UX refinement. Bug tracking should include issues discovered during validation such as seed setup problems, missing search/filter behavior, checkout validation flow, or missing order fields.</w:t>
       </w:r>
     </w:p>
     <w:tbl>
@@ -9937,11 +10267,47 @@
             <w:vAlign w:val="center"/>
           </w:tcPr>
           <w:p>
+            <w:proofErr w:type="spellStart"/>
             <w:r>
               <w:rPr>
                 <w:sz w:val="16"/>
               </w:rPr>
-              <w:t>ProductCard, CategoryPage, CartContext, Checkout UI, Auth API</w:t>
+              <w:t>ProductCard</w:t>
+            </w:r>
+            <w:proofErr w:type="spellEnd"/>
+            <w:r>
+              <w:rPr>
+                <w:sz w:val="16"/>
+              </w:rPr>
+              <w:t xml:space="preserve">, </w:t>
+            </w:r>
+            <w:proofErr w:type="spellStart"/>
+            <w:r>
+              <w:rPr>
+                <w:sz w:val="16"/>
+              </w:rPr>
+              <w:t>CategoryPage</w:t>
+            </w:r>
+            <w:proofErr w:type="spellEnd"/>
+            <w:r>
+              <w:rPr>
+                <w:sz w:val="16"/>
+              </w:rPr>
+              <w:t xml:space="preserve">, </w:t>
+            </w:r>
+            <w:proofErr w:type="spellStart"/>
+            <w:r>
+              <w:rPr>
+                <w:sz w:val="16"/>
+              </w:rPr>
+              <w:t>CartContext</w:t>
+            </w:r>
+            <w:proofErr w:type="spellEnd"/>
+            <w:r>
+              <w:rPr>
+                <w:sz w:val="16"/>
+              </w:rPr>
+              <w:t>, Checkout UI, Auth API</w:t>
             </w:r>
           </w:p>
         </w:tc>
@@ -9974,7 +10340,21 @@
               <w:rPr>
                 <w:sz w:val="16"/>
               </w:rPr>
-              <w:t>Refactor services, improve UX states, add .env.example, update README</w:t>
+              <w:t>Refactor services, improve UX states, add .</w:t>
+            </w:r>
+            <w:proofErr w:type="spellStart"/>
+            <w:r>
+              <w:rPr>
+                <w:sz w:val="16"/>
+              </w:rPr>
+              <w:t>env.example</w:t>
+            </w:r>
+            <w:proofErr w:type="spellEnd"/>
+            <w:r>
+              <w:rPr>
+                <w:sz w:val="16"/>
+              </w:rPr>
+              <w:t>, update README</w:t>
             </w:r>
           </w:p>
         </w:tc>
@@ -10153,11 +10533,33 @@
             <w:vAlign w:val="center"/>
           </w:tcPr>
           <w:p>
-            <w:r>
-              <w:rPr>
-                <w:sz w:val="15"/>
-              </w:rPr>
-              <w:t>HomePage, categoryService/API</w:t>
+            <w:proofErr w:type="spellStart"/>
+            <w:r>
+              <w:rPr>
+                <w:sz w:val="15"/>
+              </w:rPr>
+              <w:t>HomePage</w:t>
+            </w:r>
+            <w:proofErr w:type="spellEnd"/>
+            <w:r>
+              <w:rPr>
+                <w:sz w:val="15"/>
+              </w:rPr>
+              <w:t xml:space="preserve">, </w:t>
+            </w:r>
+            <w:proofErr w:type="spellStart"/>
+            <w:r>
+              <w:rPr>
+                <w:sz w:val="15"/>
+              </w:rPr>
+              <w:t>categoryService</w:t>
+            </w:r>
+            <w:proofErr w:type="spellEnd"/>
+            <w:r>
+              <w:rPr>
+                <w:sz w:val="15"/>
+              </w:rPr>
+              <w:t>/API</w:t>
             </w:r>
           </w:p>
         </w:tc>
@@ -10200,11 +10602,33 @@
             <w:vAlign w:val="center"/>
           </w:tcPr>
           <w:p>
-            <w:r>
-              <w:rPr>
-                <w:sz w:val="15"/>
-              </w:rPr>
-              <w:t>CategoryPage, productService/API</w:t>
+            <w:proofErr w:type="spellStart"/>
+            <w:r>
+              <w:rPr>
+                <w:sz w:val="15"/>
+              </w:rPr>
+              <w:t>CategoryPage</w:t>
+            </w:r>
+            <w:proofErr w:type="spellEnd"/>
+            <w:r>
+              <w:rPr>
+                <w:sz w:val="15"/>
+              </w:rPr>
+              <w:t xml:space="preserve">, </w:t>
+            </w:r>
+            <w:proofErr w:type="spellStart"/>
+            <w:r>
+              <w:rPr>
+                <w:sz w:val="15"/>
+              </w:rPr>
+              <w:t>productService</w:t>
+            </w:r>
+            <w:proofErr w:type="spellEnd"/>
+            <w:r>
+              <w:rPr>
+                <w:sz w:val="15"/>
+              </w:rPr>
+              <w:t>/API</w:t>
             </w:r>
           </w:p>
         </w:tc>
@@ -10247,12 +10671,14 @@
             <w:vAlign w:val="center"/>
           </w:tcPr>
           <w:p>
+            <w:proofErr w:type="spellStart"/>
             <w:r>
               <w:rPr>
                 <w:sz w:val="15"/>
               </w:rPr>
               <w:t>CategoryPage</w:t>
             </w:r>
+            <w:proofErr w:type="spellEnd"/>
           </w:p>
         </w:tc>
         <w:tc>
@@ -10294,12 +10720,14 @@
             <w:vAlign w:val="center"/>
           </w:tcPr>
           <w:p>
+            <w:proofErr w:type="spellStart"/>
             <w:r>
               <w:rPr>
                 <w:sz w:val="15"/>
               </w:rPr>
               <w:t>ProductPage</w:t>
             </w:r>
+            <w:proofErr w:type="spellEnd"/>
           </w:p>
         </w:tc>
         <w:tc>
@@ -10341,12 +10769,42 @@
             <w:vAlign w:val="center"/>
           </w:tcPr>
           <w:p>
-            <w:r>
-              <w:rPr>
-                <w:sz w:val="15"/>
-              </w:rPr>
-              <w:t>CartContext, CartPage, ProductCard</w:t>
-            </w:r>
+            <w:proofErr w:type="spellStart"/>
+            <w:r>
+              <w:rPr>
+                <w:sz w:val="15"/>
+              </w:rPr>
+              <w:t>CartContext</w:t>
+            </w:r>
+            <w:proofErr w:type="spellEnd"/>
+            <w:r>
+              <w:rPr>
+                <w:sz w:val="15"/>
+              </w:rPr>
+              <w:t xml:space="preserve">, </w:t>
+            </w:r>
+            <w:proofErr w:type="spellStart"/>
+            <w:r>
+              <w:rPr>
+                <w:sz w:val="15"/>
+              </w:rPr>
+              <w:t>CartPage</w:t>
+            </w:r>
+            <w:proofErr w:type="spellEnd"/>
+            <w:r>
+              <w:rPr>
+                <w:sz w:val="15"/>
+              </w:rPr>
+              <w:t xml:space="preserve">, </w:t>
+            </w:r>
+            <w:proofErr w:type="spellStart"/>
+            <w:r>
+              <w:rPr>
+                <w:sz w:val="15"/>
+              </w:rPr>
+              <w:t>ProductCard</w:t>
+            </w:r>
+            <w:proofErr w:type="spellEnd"/>
           </w:p>
         </w:tc>
         <w:tc>
@@ -10388,11 +10846,47 @@
             <w:vAlign w:val="center"/>
           </w:tcPr>
           <w:p>
-            <w:r>
-              <w:rPr>
-                <w:sz w:val="15"/>
-              </w:rPr>
-              <w:t>CheckoutPage, OrderSummary, orderService/API</w:t>
+            <w:proofErr w:type="spellStart"/>
+            <w:r>
+              <w:rPr>
+                <w:sz w:val="15"/>
+              </w:rPr>
+              <w:t>CheckoutPage</w:t>
+            </w:r>
+            <w:proofErr w:type="spellEnd"/>
+            <w:r>
+              <w:rPr>
+                <w:sz w:val="15"/>
+              </w:rPr>
+              <w:t xml:space="preserve">, </w:t>
+            </w:r>
+            <w:proofErr w:type="spellStart"/>
+            <w:r>
+              <w:rPr>
+                <w:sz w:val="15"/>
+              </w:rPr>
+              <w:t>OrderSummary</w:t>
+            </w:r>
+            <w:proofErr w:type="spellEnd"/>
+            <w:r>
+              <w:rPr>
+                <w:sz w:val="15"/>
+              </w:rPr>
+              <w:t xml:space="preserve">, </w:t>
+            </w:r>
+            <w:proofErr w:type="spellStart"/>
+            <w:r>
+              <w:rPr>
+                <w:sz w:val="15"/>
+              </w:rPr>
+              <w:t>orderService</w:t>
+            </w:r>
+            <w:proofErr w:type="spellEnd"/>
+            <w:r>
+              <w:rPr>
+                <w:sz w:val="15"/>
+              </w:rPr>
+              <w:t>/API</w:t>
             </w:r>
           </w:p>
         </w:tc>
@@ -10435,11 +10929,19 @@
             <w:vAlign w:val="center"/>
           </w:tcPr>
           <w:p>
-            <w:r>
-              <w:rPr>
-                <w:sz w:val="15"/>
-              </w:rPr>
-              <w:t>authController, auth routes, middleware</w:t>
+            <w:proofErr w:type="spellStart"/>
+            <w:r>
+              <w:rPr>
+                <w:sz w:val="15"/>
+              </w:rPr>
+              <w:t>authController</w:t>
+            </w:r>
+            <w:proofErr w:type="spellEnd"/>
+            <w:r>
+              <w:rPr>
+                <w:sz w:val="15"/>
+              </w:rPr>
+              <w:t>, auth routes, middleware</w:t>
             </w:r>
           </w:p>
         </w:tc>
@@ -10482,11 +10984,19 @@
             <w:vAlign w:val="center"/>
           </w:tcPr>
           <w:p>
-            <w:r>
-              <w:rPr>
-                <w:sz w:val="15"/>
-              </w:rPr>
-              <w:t>LanguageContext, i18n files</w:t>
+            <w:proofErr w:type="spellStart"/>
+            <w:r>
+              <w:rPr>
+                <w:sz w:val="15"/>
+              </w:rPr>
+              <w:t>LanguageContext</w:t>
+            </w:r>
+            <w:proofErr w:type="spellEnd"/>
+            <w:r>
+              <w:rPr>
+                <w:sz w:val="15"/>
+              </w:rPr>
+              <w:t>, i18n files</w:t>
             </w:r>
           </w:p>
         </w:tc>
@@ -10500,7 +11010,21 @@
               <w:rPr>
                 <w:sz w:val="15"/>
               </w:rPr>
-              <w:t>Switch language and verify dir/lang and labels.</w:t>
+              <w:t xml:space="preserve">Switch language and verify </w:t>
+            </w:r>
+            <w:proofErr w:type="spellStart"/>
+            <w:r>
+              <w:rPr>
+                <w:sz w:val="15"/>
+              </w:rPr>
+              <w:t>dir</w:t>
+            </w:r>
+            <w:proofErr w:type="spellEnd"/>
+            <w:r>
+              <w:rPr>
+                <w:sz w:val="15"/>
+              </w:rPr>
+              <w:t>/lang and labels.</w:t>
             </w:r>
           </w:p>
         </w:tc>
@@ -10632,8 +11156,8 @@
         <w:tblLook w:val="04A0" w:firstRow="1" w:lastRow="0" w:firstColumn="1" w:lastColumn="0" w:noHBand="0" w:noVBand="1"/>
       </w:tblPr>
       <w:tblGrid>
-        <w:gridCol w:w="1146"/>
-        <w:gridCol w:w="3005"/>
+        <w:gridCol w:w="1147"/>
+        <w:gridCol w:w="3004"/>
         <w:gridCol w:w="4283"/>
         <w:gridCol w:w="1862"/>
       </w:tblGrid>
@@ -10734,7 +11258,21 @@
               <w:rPr>
                 <w:sz w:val="15"/>
               </w:rPr>
-              <w:t>/api/categories</w:t>
+              <w:t>/</w:t>
+            </w:r>
+            <w:proofErr w:type="spellStart"/>
+            <w:r>
+              <w:rPr>
+                <w:sz w:val="15"/>
+              </w:rPr>
+              <w:t>api</w:t>
+            </w:r>
+            <w:proofErr w:type="spellEnd"/>
+            <w:r>
+              <w:rPr>
+                <w:sz w:val="15"/>
+              </w:rPr>
+              <w:t>/categories</w:t>
             </w:r>
           </w:p>
         </w:tc>
@@ -10762,7 +11300,7 @@
               <w:rPr>
                 <w:sz w:val="15"/>
               </w:rPr>
-              <w:t>Implemented / expected</w:t>
+              <w:t xml:space="preserve">Implemented </w:t>
             </w:r>
           </w:p>
         </w:tc>
@@ -10795,7 +11333,21 @@
               <w:rPr>
                 <w:sz w:val="15"/>
               </w:rPr>
-              <w:t>/api/products</w:t>
+              <w:t>/</w:t>
+            </w:r>
+            <w:proofErr w:type="spellStart"/>
+            <w:r>
+              <w:rPr>
+                <w:sz w:val="15"/>
+              </w:rPr>
+              <w:t>api</w:t>
+            </w:r>
+            <w:proofErr w:type="spellEnd"/>
+            <w:r>
+              <w:rPr>
+                <w:sz w:val="15"/>
+              </w:rPr>
+              <w:t>/products</w:t>
             </w:r>
           </w:p>
         </w:tc>
@@ -10823,7 +11375,7 @@
               <w:rPr>
                 <w:sz w:val="15"/>
               </w:rPr>
-              <w:t>Implemented / expected</w:t>
+              <w:t xml:space="preserve">Implemented </w:t>
             </w:r>
           </w:p>
         </w:tc>
@@ -10852,11 +11404,30 @@
             <w:vAlign w:val="center"/>
           </w:tcPr>
           <w:p>
-            <w:r>
-              <w:rPr>
-                <w:sz w:val="15"/>
-              </w:rPr>
-              <w:t>/api/products/:slug</w:t>
+            <w:pPr>
+              <w:rPr>
+                <w:sz w:val="15"/>
+              </w:rPr>
+            </w:pPr>
+            <w:r>
+              <w:rPr>
+                <w:sz w:val="15"/>
+              </w:rPr>
+              <w:t>/</w:t>
+            </w:r>
+            <w:proofErr w:type="spellStart"/>
+            <w:r>
+              <w:rPr>
+                <w:sz w:val="15"/>
+              </w:rPr>
+              <w:t>api</w:t>
+            </w:r>
+            <w:proofErr w:type="spellEnd"/>
+            <w:r>
+              <w:rPr>
+                <w:sz w:val="15"/>
+              </w:rPr>
+              <w:t>/products/:id</w:t>
             </w:r>
           </w:p>
         </w:tc>
@@ -10884,7 +11455,7 @@
               <w:rPr>
                 <w:sz w:val="15"/>
               </w:rPr>
-              <w:t>Implemented / expected</w:t>
+              <w:t xml:space="preserve">Implemented </w:t>
             </w:r>
           </w:p>
         </w:tc>
@@ -10917,7 +11488,21 @@
               <w:rPr>
                 <w:sz w:val="15"/>
               </w:rPr>
-              <w:t>/api/auth/register</w:t>
+              <w:t>/</w:t>
+            </w:r>
+            <w:proofErr w:type="spellStart"/>
+            <w:r>
+              <w:rPr>
+                <w:sz w:val="15"/>
+              </w:rPr>
+              <w:t>api</w:t>
+            </w:r>
+            <w:proofErr w:type="spellEnd"/>
+            <w:r>
+              <w:rPr>
+                <w:sz w:val="15"/>
+              </w:rPr>
+              <w:t>/auth/register</w:t>
             </w:r>
           </w:p>
         </w:tc>
@@ -10978,7 +11563,21 @@
               <w:rPr>
                 <w:sz w:val="15"/>
               </w:rPr>
-              <w:t>/api/auth/login</w:t>
+              <w:t>/</w:t>
+            </w:r>
+            <w:proofErr w:type="spellStart"/>
+            <w:r>
+              <w:rPr>
+                <w:sz w:val="15"/>
+              </w:rPr>
+              <w:t>api</w:t>
+            </w:r>
+            <w:proofErr w:type="spellEnd"/>
+            <w:r>
+              <w:rPr>
+                <w:sz w:val="15"/>
+              </w:rPr>
+              <w:t>/auth/login</w:t>
             </w:r>
           </w:p>
         </w:tc>
@@ -11039,7 +11638,21 @@
               <w:rPr>
                 <w:sz w:val="15"/>
               </w:rPr>
-              <w:t>/api/auth/logout</w:t>
+              <w:t>/</w:t>
+            </w:r>
+            <w:proofErr w:type="spellStart"/>
+            <w:r>
+              <w:rPr>
+                <w:sz w:val="15"/>
+              </w:rPr>
+              <w:t>api</w:t>
+            </w:r>
+            <w:proofErr w:type="spellEnd"/>
+            <w:r>
+              <w:rPr>
+                <w:sz w:val="15"/>
+              </w:rPr>
+              <w:t>/auth/logout</w:t>
             </w:r>
           </w:p>
         </w:tc>
@@ -11100,7 +11713,21 @@
               <w:rPr>
                 <w:sz w:val="15"/>
               </w:rPr>
-              <w:t>/api/orders</w:t>
+              <w:t>/</w:t>
+            </w:r>
+            <w:proofErr w:type="spellStart"/>
+            <w:r>
+              <w:rPr>
+                <w:sz w:val="15"/>
+              </w:rPr>
+              <w:t>api</w:t>
+            </w:r>
+            <w:proofErr w:type="spellEnd"/>
+            <w:r>
+              <w:rPr>
+                <w:sz w:val="15"/>
+              </w:rPr>
+              <w:t>/orders</w:t>
             </w:r>
           </w:p>
         </w:tc>
@@ -11128,7 +11755,7 @@
               <w:rPr>
                 <w:sz w:val="15"/>
               </w:rPr>
-              <w:t>Implemented / verify final payload</w:t>
+              <w:t>Implemented</w:t>
             </w:r>
           </w:p>
         </w:tc>
@@ -11161,7 +11788,21 @@
               <w:rPr>
                 <w:sz w:val="15"/>
               </w:rPr>
-              <w:t>/api/orders/my</w:t>
+              <w:t>/</w:t>
+            </w:r>
+            <w:proofErr w:type="spellStart"/>
+            <w:r>
+              <w:rPr>
+                <w:sz w:val="15"/>
+              </w:rPr>
+              <w:t>api</w:t>
+            </w:r>
+            <w:proofErr w:type="spellEnd"/>
+            <w:r>
+              <w:rPr>
+                <w:sz w:val="15"/>
+              </w:rPr>
+              <w:t>/orders/my</w:t>
             </w:r>
           </w:p>
         </w:tc>
@@ -11218,11 +11859,30 @@
             <w:vAlign w:val="center"/>
           </w:tcPr>
           <w:p>
-            <w:r>
-              <w:rPr>
-                <w:sz w:val="15"/>
-              </w:rPr>
-              <w:t>/api/admin/orders</w:t>
+            <w:pPr>
+              <w:rPr>
+                <w:sz w:val="15"/>
+              </w:rPr>
+            </w:pPr>
+            <w:r>
+              <w:rPr>
+                <w:sz w:val="15"/>
+              </w:rPr>
+              <w:t>/</w:t>
+            </w:r>
+            <w:proofErr w:type="spellStart"/>
+            <w:r>
+              <w:rPr>
+                <w:sz w:val="15"/>
+              </w:rPr>
+              <w:t>api</w:t>
+            </w:r>
+            <w:proofErr w:type="spellEnd"/>
+            <w:r>
+              <w:rPr>
+                <w:sz w:val="15"/>
+              </w:rPr>
+              <w:t>/orders</w:t>
             </w:r>
           </w:p>
         </w:tc>
@@ -11232,11 +11892,16 @@
             <w:vAlign w:val="center"/>
           </w:tcPr>
           <w:p>
-            <w:r>
-              <w:rPr>
-                <w:sz w:val="15"/>
-              </w:rPr>
-              <w:t>Return all orders for admin</w:t>
+            <w:pPr>
+              <w:rPr>
+                <w:sz w:val="15"/>
+              </w:rPr>
+            </w:pPr>
+            <w:r>
+              <w:rPr>
+                <w:sz w:val="15"/>
+              </w:rPr>
+              <w:t>Return all orders for admin users through a protected route.</w:t>
             </w:r>
           </w:p>
         </w:tc>
@@ -11422,7 +12087,21 @@
               <w:rPr>
                 <w:sz w:val="16"/>
               </w:rPr>
-              <w:t>Revised to match YallaMarket digital marketplace scope, bilingual UI, frontend-first architecture, and future Express + SQLite plan.</w:t>
+              <w:t xml:space="preserve">Revised to match </w:t>
+            </w:r>
+            <w:proofErr w:type="spellStart"/>
+            <w:r>
+              <w:rPr>
+                <w:sz w:val="16"/>
+              </w:rPr>
+              <w:t>YallaMarket</w:t>
+            </w:r>
+            <w:proofErr w:type="spellEnd"/>
+            <w:r>
+              <w:rPr>
+                <w:sz w:val="16"/>
+              </w:rPr>
+              <w:t xml:space="preserve"> digital marketplace scope, bilingual UI, frontend-first architecture, and future Express + SQLite plan.</w:t>
             </w:r>
           </w:p>
         </w:tc>
@@ -11572,8 +12251,13 @@
       <w:pStyle w:val="Header"/>
       <w:jc w:val="right"/>
     </w:pPr>
+    <w:proofErr w:type="spellStart"/>
     <w:r>
-      <w:t>YallaMarket | Software Requirements Specification | Version 3.0</w:t>
+      <w:t>YallaMarket</w:t>
+    </w:r>
+    <w:proofErr w:type="spellEnd"/>
+    <w:r>
+      <w:t xml:space="preserve"> | Software Requirements Specification | Version 3.0</w:t>
     </w:r>
   </w:p>
 </w:hdr>
@@ -12388,7 +13072,6 @@
   <w:style w:type="character" w:default="1" w:styleId="DefaultParagraphFont">
     <w:name w:val="Default Paragraph Font"/>
     <w:uiPriority w:val="1"/>
-    <w:semiHidden/>
     <w:unhideWhenUsed/>
   </w:style>
   <w:style w:type="table" w:default="1" w:styleId="TableNormal">
@@ -23172,6 +23855,66 @@
       <w:sz w:val="17"/>
     </w:rPr>
   </w:style>
+  <w:style w:type="paragraph" w:styleId="HTMLPreformatted">
+    <w:name w:val="HTML Preformatted"/>
+    <w:basedOn w:val="Normal"/>
+    <w:link w:val="HTMLPreformattedChar"/>
+    <w:uiPriority w:val="99"/>
+    <w:semiHidden/>
+    <w:unhideWhenUsed/>
+    <w:rsid w:val="00DC08C5"/>
+    <w:pPr>
+      <w:tabs>
+        <w:tab w:val="left" w:pos="916"/>
+        <w:tab w:val="left" w:pos="1832"/>
+        <w:tab w:val="left" w:pos="2748"/>
+        <w:tab w:val="left" w:pos="3664"/>
+        <w:tab w:val="left" w:pos="4580"/>
+        <w:tab w:val="left" w:pos="5496"/>
+        <w:tab w:val="left" w:pos="6412"/>
+        <w:tab w:val="left" w:pos="7328"/>
+        <w:tab w:val="left" w:pos="8244"/>
+        <w:tab w:val="left" w:pos="9160"/>
+        <w:tab w:val="left" w:pos="10076"/>
+        <w:tab w:val="left" w:pos="10992"/>
+        <w:tab w:val="left" w:pos="11908"/>
+        <w:tab w:val="left" w:pos="12824"/>
+        <w:tab w:val="left" w:pos="13740"/>
+        <w:tab w:val="left" w:pos="14656"/>
+      </w:tabs>
+      <w:spacing w:after="0" w:line="240" w:lineRule="auto"/>
+    </w:pPr>
+    <w:rPr>
+      <w:rFonts w:ascii="Courier New" w:eastAsia="Times New Roman" w:hAnsi="Courier New" w:cs="Courier New"/>
+      <w:szCs w:val="20"/>
+    </w:rPr>
+  </w:style>
+  <w:style w:type="character" w:customStyle="1" w:styleId="HTMLPreformattedChar">
+    <w:name w:val="HTML Preformatted Char"/>
+    <w:basedOn w:val="DefaultParagraphFont"/>
+    <w:link w:val="HTMLPreformatted"/>
+    <w:uiPriority w:val="99"/>
+    <w:semiHidden/>
+    <w:rsid w:val="00DC08C5"/>
+    <w:rPr>
+      <w:rFonts w:ascii="Courier New" w:eastAsia="Times New Roman" w:hAnsi="Courier New" w:cs="Courier New"/>
+      <w:sz w:val="20"/>
+      <w:szCs w:val="20"/>
+    </w:rPr>
+  </w:style>
+  <w:style w:type="character" w:styleId="HTMLCode">
+    <w:name w:val="HTML Code"/>
+    <w:basedOn w:val="DefaultParagraphFont"/>
+    <w:uiPriority w:val="99"/>
+    <w:semiHidden/>
+    <w:unhideWhenUsed/>
+    <w:rsid w:val="00DC08C5"/>
+    <w:rPr>
+      <w:rFonts w:ascii="Courier New" w:eastAsia="Times New Roman" w:hAnsi="Courier New" w:cs="Courier New"/>
+      <w:sz w:val="20"/>
+      <w:szCs w:val="20"/>
+    </w:rPr>
+  </w:style>
 </w:styles>
 </file>
 

</xml_diff>